<commit_message>
I assure you that this game is fully operational!
</commit_message>
<xml_diff>
--- a/Sprint 4 - Machine Learning Research Report.docx
+++ b/Sprint 4 - Machine Learning Research Report.docx
@@ -46,7 +46,6 @@
       <w:r>
         <w:t xml:space="preserve">This week, I spent about 2 hours researching Q-learning and the documentation related to creating a custom </w:t>
       </w:r>
-      <w:proofErr w:type="spellStart"/>
       <w:r>
         <w:t>P</w:t>
       </w:r>
@@ -57,11 +56,7 @@
         <w:t>gZ</w:t>
       </w:r>
       <w:r>
-        <w:t>oo</w:t>
-      </w:r>
-      <w:proofErr w:type="spellEnd"/>
-      <w:r>
-        <w:t xml:space="preserve"> environment. I spent an additional 8 hours working on sprites for the human rendering of the game</w:t>
+        <w:t>oo environment. I spent an additional 8 hours working on sprites for the human rendering of the game</w:t>
       </w:r>
       <w:r>
         <w:t xml:space="preserve"> so I</w:t>
@@ -85,42 +80,22 @@
           <w:bCs/>
         </w:rPr>
       </w:pPr>
-      <w:proofErr w:type="spellStart"/>
       <w:r>
         <w:rPr>
           <w:b/>
           <w:bCs/>
         </w:rPr>
-        <w:t>PettingZoo</w:t>
-      </w:r>
-      <w:proofErr w:type="spellEnd"/>
-      <w:r>
-        <w:rPr>
-          <w:b/>
-          <w:bCs/>
-        </w:rPr>
-        <w:t xml:space="preserve"> Research</w:t>
-      </w:r>
-    </w:p>
-    <w:p>
-      <w:r>
-        <w:t>I found this 23-page research paper titled “</w:t>
-      </w:r>
-      <w:proofErr w:type="spellStart"/>
-      <w:r>
-        <w:t>PettingZoo</w:t>
-      </w:r>
-      <w:proofErr w:type="spellEnd"/>
-      <w:r>
-        <w:t>: A Standard API for Multi-Agent</w:t>
-      </w:r>
-    </w:p>
-    <w:p>
-      <w:r>
-        <w:t>Reinforcement Learning</w:t>
-      </w:r>
-      <w:r>
-        <w:t xml:space="preserve">”: </w:t>
+        <w:t>PettingZoo Research</w:t>
+      </w:r>
+    </w:p>
+    <w:p>
+      <w:r>
+        <w:t>I found this 23-page research paper titled “PettingZoo: A Standard API for Multi-Agent</w:t>
+      </w:r>
+    </w:p>
+    <w:p>
+      <w:r>
+        <w:t xml:space="preserve">Reinforcement Learning”: </w:t>
       </w:r>
       <w:hyperlink r:id="rId6" w:history="1">
         <w:r>
@@ -133,23 +108,7 @@
     </w:p>
     <w:p>
       <w:r>
-        <w:t xml:space="preserve">This paper praised the work done by Open AI’s gym for the realm of single agent reinforcement learning. By standardizing that field, it made research in that area much easier and simpler. PettingZoo’s goal was to </w:t>
-      </w:r>
-      <w:proofErr w:type="gramStart"/>
-      <w:r>
-        <w:t>do for</w:t>
-      </w:r>
-      <w:proofErr w:type="gramEnd"/>
-      <w:r>
-        <w:t xml:space="preserve"> multi-agent reinforcement learning (MARL) what open AI’s gym had done for single-agent reinforcement learning. The researchers started by looking into research in the field and noticed that the two </w:t>
-      </w:r>
-      <w:proofErr w:type="gramStart"/>
-      <w:r>
-        <w:t>most commonly used</w:t>
-      </w:r>
-      <w:proofErr w:type="gramEnd"/>
-      <w:r>
-        <w:t xml:space="preserve"> models at the time for MARL were both poorly suited to the </w:t>
+        <w:t xml:space="preserve">This paper praised the work done by Open AI’s gym for the realm of single agent reinforcement learning. By standardizing that field, it made research in that area much easier and simpler. PettingZoo’s goal was to do for multi-agent reinforcement learning (MARL) what open AI’s gym had done for single-agent reinforcement learning. The researchers started by looking into research in the field and noticed that the two most commonly used models at the time for MARL were both poorly suited to the </w:t>
       </w:r>
       <w:r>
         <w:t>task and</w:t>
@@ -160,15 +119,7 @@
     </w:p>
     <w:p>
       <w:r>
-        <w:t xml:space="preserve">Therefore, the developers of </w:t>
-      </w:r>
-      <w:proofErr w:type="spellStart"/>
-      <w:r>
-        <w:t>PettingZoo</w:t>
-      </w:r>
-      <w:proofErr w:type="spellEnd"/>
-      <w:r>
-        <w:t xml:space="preserve"> created their own model for MARL, known as the Agent-Environment-Cycle (AEC), which to them seemed to be a much more natural way to represent games, and allowed for much greater flexibility for the kinds of games that could be represented and the kinds of agents that could be trained.</w:t>
+        <w:t>Therefore, the developers of PettingZoo created their own model for MARL, known as the Agent-Environment-Cycle (AEC), which to them seemed to be a much more natural way to represent games, and allowed for much greater flexibility for the kinds of games that could be represented and the kinds of agents that could be trained.</w:t>
       </w:r>
     </w:p>
     <w:p>
@@ -179,23 +130,7 @@
     <w:p/>
     <w:p>
       <w:r>
-        <w:t xml:space="preserve">I also read through the documentation found online for implementing </w:t>
-      </w:r>
-      <w:proofErr w:type="spellStart"/>
-      <w:r>
-        <w:t>PettingZoo</w:t>
-      </w:r>
-      <w:proofErr w:type="spellEnd"/>
-      <w:r>
-        <w:t xml:space="preserve"> into custom environments. I was </w:t>
-      </w:r>
-      <w:proofErr w:type="gramStart"/>
-      <w:r>
-        <w:t>really excited</w:t>
-      </w:r>
-      <w:proofErr w:type="gramEnd"/>
-      <w:r>
-        <w:t xml:space="preserve"> to implement this, but alas, making the sprites ended up taking a while, and the other homework I had this week kept me busy. In fact, right now I am at the University of Kentucky, and have just finished a tour of it. My fiancé and I were both accepted to the University and are waiting to hear how large the stipend we will get will be. It was nice of the physics department at the University of Kentucky to pay for this trip, but it has also come with long waiting times at airports and flight times on planes that have significantly reduced the amount of time I had </w:t>
+        <w:t xml:space="preserve">I also read through the documentation found online for implementing PettingZoo into custom environments. I was really excited to implement this, but alas, making the sprites ended up taking a while, and the other homework I had this week kept me busy. In fact, right now I am at the University of Kentucky, and have just finished a tour of it. My fiancé and I were both accepted to the University and are waiting to hear how large the stipend we will get will be. It was nice of the physics department at the University of Kentucky to pay for this trip, but it has also come with long waiting times at airports and flight times on planes that have significantly reduced the amount of time I had </w:t>
       </w:r>
       <w:r>
         <w:lastRenderedPageBreak/>
@@ -204,15 +139,7 @@
     </w:p>
     <w:p>
       <w:r>
-        <w:t xml:space="preserve">Anyways, I am hoping to be able to continue this project next sprint, if I am afforded the opportunity to. But I’ve gotten far enough into this project now and am excited about it enough, that even if I don’t get to work on </w:t>
-      </w:r>
-      <w:proofErr w:type="gramStart"/>
-      <w:r>
-        <w:t>it</w:t>
-      </w:r>
-      <w:proofErr w:type="gramEnd"/>
-      <w:r>
-        <w:t xml:space="preserve"> next sprint, I will definitely work on it over the summer, because I’m excited to see this project brought to a final conclusion: the game I’ve wished I could have since childhood! Maybe that is what it means to be a strong, independent gamer. You don’t just wait for other people to make games for you; you make your own games!</w:t>
+        <w:t>Anyways, I am hoping to be able to continue this project next sprint, if I am afforded the opportunity to. But I’ve gotten far enough into this project now and am excited about it enough, that even if I don’t get to work on it next sprint, I will definitely work on it over the summer, because I’m excited to see this project brought to a final conclusion: the game I’ve wished I could have since childhood! Maybe that is what it means to be a strong, independent gamer. You don’t just wait for other people to make games for you; you make your own games!</w:t>
       </w:r>
     </w:p>
     <w:p>
@@ -246,6 +173,7 @@
         <w:t>interact with both the environment and the agents, acting as a kind of intermediate actor. At least, that is how I understand it. Q-learning comes with many advantages over more traditional methods because it greatly simplifies the process of training AI to seek out rewards and find methods to optimize their greatest rewards by simply letting the agent know what the reward predicted for a given action is before they take it. Therefore, they can make informed decisions on what methods to use to try and maximize their reward.</w:t>
       </w:r>
     </w:p>
+    <w:p/>
     <w:sectPr>
       <w:headerReference w:type="default" r:id="rId7"/>
       <w:pgSz w:w="12240" w:h="15840"/>

</xml_diff>